<commit_message>
modificacion en el SRS
</commit_message>
<xml_diff>
--- a/SRS listo-1.docx
+++ b/SRS listo-1.docx
@@ -4884,29 +4884,6 @@
           <w:rtl w:val="0"/>
         </w:rPr>
         <w:t xml:space="preserve">Configuración de umbrales: El usuario podrá establecer límites de consumo de energía y definir la frecuencia con la que desea recibir notificaciones sobre su uso.</w:t>
-      </w:r>
-    </w:p>
-    <w:p>
-      <w:pPr>
-        <w:pBdr>
-          <w:top w:space="0" w:sz="0" w:val="nil"/>
-          <w:left w:space="0" w:sz="0" w:val="nil"/>
-          <w:bottom w:space="0" w:sz="0" w:val="nil"/>
-          <w:right w:space="0" w:sz="0" w:val="nil"/>
-          <w:between w:space="0" w:sz="0" w:val="nil"/>
-        </w:pBdr>
-        <w:spacing w:before="62" w:line="480" w:lineRule="auto"/>
-        <w:ind w:left="720" w:right="1321" w:firstLine="720"/>
-        <w:rPr>
-          <w:color w:val="000000"/>
-        </w:rPr>
-      </w:pPr>
-      <w:r>
-        <w:rPr>
-          <w:color w:val="000000"/>
-          <w:rtl w:val="0"/>
-        </w:rPr>
-        <w:t xml:space="preserve">Ingreso de consumo: Esta sección permite al usuario registrar manualmente su consumo eléctrico, utilizando la información de su recibo de luz.</w:t>
       </w:r>
     </w:p>
     <w:p>

</xml_diff>

<commit_message>
modificacion en diagrama de clases RF1 aplicando la opcion de eliminar cuenta
</commit_message>
<xml_diff>
--- a/SRS listo-1.docx
+++ b/SRS listo-1.docx
@@ -7145,7 +7145,7 @@
         <w:rPr>
           <w:rtl w:val="0"/>
         </w:rPr>
-        <w:t xml:space="preserve">Los usuarios podran eliminar su cuenta, si ya no desean usar el servicio.</w:t>
+        <w:t xml:space="preserve">Los usuarios podrán eliminar su cuenta, si ya no desean usar el servicio.</w:t>
       </w:r>
     </w:p>
     <w:p>
@@ -10751,7 +10751,6 @@
     </w:p>
     <w:p>
       <w:pPr>
-        <w:ind w:left="1210" w:firstLine="0"/>
         <w:rPr>
           <w:b w:val="1"/>
           <w:bCs w:val="1"/>
@@ -10779,48 +10778,7 @@
     </w:p>
     <w:p>
       <w:pPr>
-        <w:ind w:left="1210" w:firstLine="0"/>
-        <w:rPr>
-          <w:b w:val="1"/>
-          <w:bCs w:val="1"/>
-        </w:rPr>
-      </w:pPr>
-      <w:r>
-        <w:rPr>
-          <w:rtl w:val="0"/>
-        </w:rPr>
-      </w:r>
-    </w:p>
-    <w:p>
-      <w:pPr>
-        <w:rPr>
-          <w:b w:val="1"/>
-          <w:bCs w:val="1"/>
-        </w:rPr>
-      </w:pPr>
-      <w:r>
-        <w:rPr>
-          <w:rtl w:val="0"/>
-        </w:rPr>
-      </w:r>
-    </w:p>
-    <w:p>
-      <w:pPr>
-        <w:ind w:left="1210" w:firstLine="0"/>
-        <w:rPr>
-          <w:b w:val="1"/>
-          <w:bCs w:val="1"/>
-        </w:rPr>
-      </w:pPr>
-      <w:r>
-        <w:rPr>
-          <w:rtl w:val="0"/>
-        </w:rPr>
-      </w:r>
-    </w:p>
-    <w:p>
-      <w:pPr>
-        <w:ind w:left="1210" w:firstLine="0"/>
+        <w:ind w:left="0" w:firstLine="0"/>
         <w:rPr>
           <w:b w:val="1"/>
           <w:bCs w:val="1"/>
@@ -10835,6 +10793,7 @@
     <w:tbl>
       <w:tblPr>
         <w:tblStyle w:val="Table10"/>
+        <w:tblpPr w:leftFromText="180" w:rightFromText="180" w:topFromText="180" w:bottomFromText="180" w:vertAnchor="text" w:horzAnchor="text" w:tblpX="1278.9999999999998" w:tblpY="0"/>
         <w:tblW w:w="8895.0" w:type="dxa"/>
         <w:jc w:val="left"/>
         <w:tblInd w:w="1225.0" w:type="dxa"/>
@@ -10870,18 +10829,12 @@
       <w:tr>
         <w:trPr>
           <w:cantSplit w:val="0"/>
-          <w:trHeight w:val="699" w:hRule="atLeast"/>
+          <w:trHeight w:val="728.935546875" w:hRule="atLeast"/>
           <w:tblHeader w:val="0"/>
         </w:trPr>
         <w:tc>
           <w:tcPr>
             <w:gridSpan w:val="4"/>
-            <w:tcBorders>
-              <w:top w:color="000000" w:space="0" w:sz="4" w:val="single"/>
-              <w:left w:color="000000" w:space="0" w:sz="4" w:val="single"/>
-              <w:bottom w:color="000000" w:space="0" w:sz="4" w:val="single"/>
-              <w:right w:color="000000" w:space="0" w:sz="4" w:val="single"/>
-            </w:tcBorders>
           </w:tcPr>
           <w:p>
             <w:pPr>
@@ -10906,12 +10859,6 @@
         <w:tc>
           <w:tcPr>
             <w:gridSpan w:val="2"/>
-            <w:tcBorders>
-              <w:top w:color="000000" w:space="0" w:sz="4" w:val="single"/>
-              <w:left w:color="000000" w:space="0" w:sz="4" w:val="single"/>
-              <w:bottom w:color="000000" w:space="0" w:sz="4" w:val="single"/>
-              <w:right w:color="000000" w:space="0" w:sz="4" w:val="single"/>
-            </w:tcBorders>
           </w:tcPr>
           <w:p>
             <w:pPr>
@@ -10952,14 +10899,7 @@
           <w:tblHeader w:val="0"/>
         </w:trPr>
         <w:tc>
-          <w:tcPr>
-            <w:tcBorders>
-              <w:top w:color="000000" w:space="0" w:sz="4" w:val="single"/>
-              <w:left w:color="000000" w:space="0" w:sz="4" w:val="single"/>
-              <w:bottom w:color="000000" w:space="0" w:sz="4" w:val="single"/>
-              <w:right w:color="000000" w:space="0" w:sz="4" w:val="single"/>
-            </w:tcBorders>
-          </w:tcPr>
+          <w:tcPr/>
           <w:p>
             <w:pPr>
               <w:rPr>
@@ -10991,12 +10931,6 @@
         <w:tc>
           <w:tcPr>
             <w:gridSpan w:val="4"/>
-            <w:tcBorders>
-              <w:top w:color="000000" w:space="0" w:sz="4" w:val="single"/>
-              <w:left w:color="000000" w:space="0" w:sz="4" w:val="single"/>
-              <w:bottom w:color="000000" w:space="0" w:sz="4" w:val="single"/>
-              <w:right w:color="000000" w:space="0" w:sz="4" w:val="single"/>
-            </w:tcBorders>
           </w:tcPr>
           <w:p>
             <w:pPr>
@@ -11028,14 +10962,7 @@
           </w:p>
         </w:tc>
         <w:tc>
-          <w:tcPr>
-            <w:tcBorders>
-              <w:top w:color="000000" w:space="0" w:sz="4" w:val="single"/>
-              <w:left w:color="000000" w:space="0" w:sz="4" w:val="single"/>
-              <w:bottom w:color="000000" w:space="0" w:sz="4" w:val="single"/>
-              <w:right w:color="000000" w:space="0" w:sz="4" w:val="single"/>
-            </w:tcBorders>
-          </w:tcPr>
+          <w:tcPr/>
           <w:p>
             <w:pPr>
               <w:rPr>
@@ -11074,12 +11001,6 @@
         <w:tc>
           <w:tcPr>
             <w:gridSpan w:val="2"/>
-            <w:tcBorders>
-              <w:top w:color="000000" w:space="0" w:sz="4" w:val="single"/>
-              <w:left w:color="000000" w:space="0" w:sz="4" w:val="single"/>
-              <w:bottom w:color="000000" w:space="0" w:sz="4" w:val="single"/>
-              <w:right w:color="000000" w:space="0" w:sz="4" w:val="single"/>
-            </w:tcBorders>
           </w:tcPr>
           <w:p>
             <w:pPr>
@@ -11112,12 +11033,6 @@
         <w:tc>
           <w:tcPr>
             <w:gridSpan w:val="4"/>
-            <w:tcBorders>
-              <w:top w:color="000000" w:space="0" w:sz="4" w:val="single"/>
-              <w:left w:color="000000" w:space="0" w:sz="4" w:val="single"/>
-              <w:bottom w:color="000000" w:space="0" w:sz="4" w:val="single"/>
-              <w:right w:color="000000" w:space="0" w:sz="4" w:val="single"/>
-            </w:tcBorders>
           </w:tcPr>
           <w:p>
             <w:pPr>
@@ -11252,12 +11167,6 @@
         <w:tc>
           <w:tcPr>
             <w:gridSpan w:val="3"/>
-            <w:tcBorders>
-              <w:top w:color="000000" w:space="0" w:sz="4" w:val="single"/>
-              <w:left w:color="000000" w:space="0" w:sz="4" w:val="single"/>
-              <w:bottom w:color="000000" w:space="0" w:sz="4" w:val="single"/>
-              <w:right w:color="000000" w:space="0" w:sz="4" w:val="single"/>
-            </w:tcBorders>
           </w:tcPr>
           <w:p>
             <w:pPr>
@@ -11283,7 +11192,6 @@
                 <w:numId w:val="8"/>
               </w:numPr>
               <w:ind w:left="720" w:hanging="360"/>
-              <w:rPr/>
             </w:pPr>
             <w:r>
               <w:rPr>
@@ -11299,7 +11207,6 @@
                 <w:numId w:val="8"/>
               </w:numPr>
               <w:ind w:left="720" w:hanging="360"/>
-              <w:rPr/>
             </w:pPr>
             <w:r>
               <w:rPr>
@@ -11315,7 +11222,6 @@
                 <w:numId w:val="8"/>
               </w:numPr>
               <w:ind w:left="720" w:hanging="360"/>
-              <w:rPr/>
             </w:pPr>
             <w:r>
               <w:rPr>
@@ -11331,7 +11237,6 @@
                 <w:numId w:val="8"/>
               </w:numPr>
               <w:ind w:left="720" w:hanging="360"/>
-              <w:rPr/>
             </w:pPr>
             <w:r>
               <w:rPr>
@@ -11354,12 +11259,6 @@
         <w:tc>
           <w:tcPr>
             <w:gridSpan w:val="3"/>
-            <w:tcBorders>
-              <w:top w:color="000000" w:space="0" w:sz="4" w:val="single"/>
-              <w:left w:color="000000" w:space="0" w:sz="4" w:val="single"/>
-              <w:bottom w:color="000000" w:space="0" w:sz="4" w:val="single"/>
-              <w:right w:color="000000" w:space="0" w:sz="4" w:val="single"/>
-            </w:tcBorders>
           </w:tcPr>
           <w:p>
             <w:pPr>
@@ -11384,7 +11283,6 @@
                 <w:numId w:val="38"/>
               </w:numPr>
               <w:ind w:left="720" w:hanging="360"/>
-              <w:rPr/>
             </w:pPr>
             <w:r>
               <w:rPr>
@@ -11400,7 +11298,6 @@
                 <w:numId w:val="38"/>
               </w:numPr>
               <w:ind w:left="720" w:hanging="360"/>
-              <w:rPr/>
             </w:pPr>
             <w:r>
               <w:rPr>
@@ -11416,7 +11313,6 @@
                 <w:numId w:val="38"/>
               </w:numPr>
               <w:ind w:left="720" w:hanging="360"/>
-              <w:rPr/>
             </w:pPr>
             <w:r>
               <w:rPr>
@@ -11432,7 +11328,6 @@
                 <w:numId w:val="38"/>
               </w:numPr>
               <w:ind w:left="720" w:hanging="360"/>
-              <w:rPr/>
             </w:pPr>
             <w:r>
               <w:rPr>
@@ -11463,12 +11358,6 @@
         <w:tc>
           <w:tcPr>
             <w:gridSpan w:val="6"/>
-            <w:tcBorders>
-              <w:top w:color="000000" w:space="0" w:sz="4" w:val="single"/>
-              <w:left w:color="000000" w:space="0" w:sz="4" w:val="single"/>
-              <w:bottom w:color="000000" w:space="0" w:sz="4" w:val="single"/>
-              <w:right w:color="000000" w:space="0" w:sz="4" w:val="single"/>
-            </w:tcBorders>
           </w:tcPr>
           <w:p>
             <w:pPr>
@@ -11501,12 +11390,6 @@
         <w:tc>
           <w:tcPr>
             <w:gridSpan w:val="6"/>
-            <w:tcBorders>
-              <w:top w:color="000000" w:space="0" w:sz="4" w:val="single"/>
-              <w:left w:color="000000" w:space="0" w:sz="4" w:val="single"/>
-              <w:bottom w:color="000000" w:space="0" w:sz="4" w:val="single"/>
-              <w:right w:color="000000" w:space="0" w:sz="4" w:val="single"/>
-            </w:tcBorders>
           </w:tcPr>
           <w:p>
             <w:pPr>
@@ -11531,7 +11414,6 @@
                 <w:numId w:val="6"/>
               </w:numPr>
               <w:ind w:left="720" w:hanging="360"/>
-              <w:rPr/>
             </w:pPr>
             <w:r>
               <w:rPr>
@@ -11547,7 +11429,6 @@
                 <w:numId w:val="6"/>
               </w:numPr>
               <w:ind w:left="720" w:hanging="360"/>
-              <w:rPr/>
             </w:pPr>
             <w:r>
               <w:rPr>
@@ -11563,7 +11444,6 @@
                 <w:numId w:val="6"/>
               </w:numPr>
               <w:ind w:left="720" w:hanging="360"/>
-              <w:rPr/>
             </w:pPr>
             <w:r>
               <w:rPr>
@@ -11579,7 +11459,6 @@
                 <w:numId w:val="6"/>
               </w:numPr>
               <w:ind w:left="720" w:hanging="360"/>
-              <w:rPr/>
             </w:pPr>
             <w:r>
               <w:rPr>
@@ -11605,7 +11484,6 @@
       <w:pPr>
         <w:ind w:left="1210" w:firstLine="0"/>
         <w:rPr>
-          <w:rFonts w:ascii="Aptos" w:cs="Aptos" w:eastAsia="Aptos" w:hAnsi="Aptos"/>
           <w:b w:val="1"/>
           <w:bCs w:val="1"/>
         </w:rPr>
@@ -11632,7 +11510,161 @@
     </w:p>
     <w:p>
       <w:pPr>
-        <w:ind w:left="1210" w:firstLine="0"/>
+        <w:ind w:firstLine="720"/>
+        <w:rPr>
+          <w:b w:val="1"/>
+          <w:bCs w:val="1"/>
+        </w:rPr>
+      </w:pPr>
+      <w:r>
+        <w:rPr>
+          <w:rtl w:val="0"/>
+        </w:rPr>
+      </w:r>
+    </w:p>
+    <w:p>
+      <w:pPr>
+        <w:ind w:firstLine="720"/>
+        <w:rPr>
+          <w:b w:val="1"/>
+          <w:bCs w:val="1"/>
+        </w:rPr>
+      </w:pPr>
+      <w:r>
+        <w:rPr>
+          <w:rtl w:val="0"/>
+        </w:rPr>
+      </w:r>
+    </w:p>
+    <w:p>
+      <w:pPr>
+        <w:ind w:firstLine="720"/>
+        <w:rPr>
+          <w:b w:val="1"/>
+          <w:bCs w:val="1"/>
+        </w:rPr>
+      </w:pPr>
+      <w:r>
+        <w:rPr>
+          <w:rtl w:val="0"/>
+        </w:rPr>
+      </w:r>
+    </w:p>
+    <w:p>
+      <w:pPr>
+        <w:ind w:firstLine="720"/>
+        <w:rPr>
+          <w:b w:val="1"/>
+          <w:bCs w:val="1"/>
+        </w:rPr>
+      </w:pPr>
+      <w:r>
+        <w:rPr>
+          <w:rtl w:val="0"/>
+        </w:rPr>
+      </w:r>
+    </w:p>
+    <w:p>
+      <w:pPr>
+        <w:ind w:firstLine="720"/>
+        <w:rPr>
+          <w:b w:val="1"/>
+          <w:bCs w:val="1"/>
+        </w:rPr>
+      </w:pPr>
+      <w:r>
+        <w:rPr>
+          <w:rtl w:val="0"/>
+        </w:rPr>
+      </w:r>
+    </w:p>
+    <w:p>
+      <w:pPr>
+        <w:ind w:firstLine="720"/>
+        <w:rPr>
+          <w:b w:val="1"/>
+          <w:bCs w:val="1"/>
+        </w:rPr>
+      </w:pPr>
+      <w:r>
+        <w:rPr>
+          <w:rtl w:val="0"/>
+        </w:rPr>
+      </w:r>
+    </w:p>
+    <w:p>
+      <w:pPr>
+        <w:ind w:firstLine="720"/>
+        <w:rPr>
+          <w:b w:val="1"/>
+          <w:bCs w:val="1"/>
+        </w:rPr>
+      </w:pPr>
+      <w:r>
+        <w:rPr>
+          <w:rtl w:val="0"/>
+        </w:rPr>
+      </w:r>
+    </w:p>
+    <w:p>
+      <w:pPr>
+        <w:ind w:firstLine="720"/>
+        <w:rPr>
+          <w:b w:val="1"/>
+          <w:bCs w:val="1"/>
+        </w:rPr>
+      </w:pPr>
+      <w:r>
+        <w:rPr>
+          <w:rtl w:val="0"/>
+        </w:rPr>
+      </w:r>
+    </w:p>
+    <w:p>
+      <w:pPr>
+        <w:ind w:firstLine="720"/>
+        <w:rPr>
+          <w:b w:val="1"/>
+          <w:bCs w:val="1"/>
+        </w:rPr>
+      </w:pPr>
+      <w:r>
+        <w:rPr>
+          <w:rtl w:val="0"/>
+        </w:rPr>
+      </w:r>
+    </w:p>
+    <w:p>
+      <w:pPr>
+        <w:ind w:firstLine="720"/>
+        <w:rPr>
+          <w:b w:val="1"/>
+          <w:bCs w:val="1"/>
+        </w:rPr>
+      </w:pPr>
+      <w:r>
+        <w:rPr>
+          <w:rtl w:val="0"/>
+        </w:rPr>
+      </w:r>
+    </w:p>
+    <w:p>
+      <w:pPr>
+        <w:ind w:firstLine="720"/>
+        <w:rPr>
+          <w:b w:val="1"/>
+          <w:bCs w:val="1"/>
+        </w:rPr>
+      </w:pPr>
+      <w:r>
+        <w:rPr>
+          <w:rtl w:val="0"/>
+        </w:rPr>
+      </w:r>
+    </w:p>
+    <w:p>
+      <w:pPr>
+        <w:ind w:firstLine="720"/>
         <w:rPr>
           <w:b w:val="1"/>
           <w:bCs w:val="1"/>

</xml_diff>

<commit_message>
añadi documentos que faltaban de la documentacion del drive
</commit_message>
<xml_diff>
--- a/SRS listo-1.docx
+++ b/SRS listo-1.docx
@@ -8200,6 +8200,126 @@
           <w:rtl w:val="0"/>
         </w:rPr>
         <w:t xml:space="preserve">El dispositivo debe ser capaz de reconectarse automáticamente al sistema en caso de pérdida de conexión WiFi o fallo temporal en la comunicación, sin intervención del usuario.</w:t>
+      </w:r>
+    </w:p>
+    <w:p>
+      <w:pPr>
+        <w:widowControl w:val="1"/>
+        <w:spacing w:after="160" w:lineRule="auto"/>
+        <w:rPr/>
+      </w:pPr>
+      <w:r>
+        <w:rPr>
+          <w:rtl w:val="0"/>
+        </w:rPr>
+      </w:r>
+    </w:p>
+    <w:p>
+      <w:pPr>
+        <w:widowControl w:val="1"/>
+        <w:spacing w:after="160" w:lineRule="auto"/>
+        <w:rPr/>
+      </w:pPr>
+      <w:r>
+        <w:rPr>
+          <w:rtl w:val="0"/>
+        </w:rPr>
+      </w:r>
+    </w:p>
+    <w:p>
+      <w:pPr>
+        <w:widowControl w:val="1"/>
+        <w:spacing w:after="160" w:lineRule="auto"/>
+        <w:rPr/>
+      </w:pPr>
+      <w:r>
+        <w:rPr>
+          <w:rtl w:val="0"/>
+        </w:rPr>
+      </w:r>
+    </w:p>
+    <w:p>
+      <w:pPr>
+        <w:widowControl w:val="1"/>
+        <w:spacing w:after="160" w:lineRule="auto"/>
+        <w:rPr/>
+      </w:pPr>
+      <w:r>
+        <w:rPr>
+          <w:rtl w:val="0"/>
+        </w:rPr>
+      </w:r>
+    </w:p>
+    <w:p>
+      <w:pPr>
+        <w:widowControl w:val="1"/>
+        <w:spacing w:after="160" w:lineRule="auto"/>
+        <w:rPr/>
+      </w:pPr>
+      <w:r>
+        <w:rPr>
+          <w:rtl w:val="0"/>
+        </w:rPr>
+      </w:r>
+    </w:p>
+    <w:p>
+      <w:pPr>
+        <w:widowControl w:val="1"/>
+        <w:spacing w:after="160" w:lineRule="auto"/>
+        <w:rPr/>
+      </w:pPr>
+      <w:r>
+        <w:rPr>
+          <w:rtl w:val="0"/>
+        </w:rPr>
+      </w:r>
+    </w:p>
+    <w:p>
+      <w:pPr>
+        <w:widowControl w:val="1"/>
+        <w:spacing w:after="160" w:lineRule="auto"/>
+        <w:rPr/>
+      </w:pPr>
+      <w:r>
+        <w:rPr>
+          <w:rtl w:val="0"/>
+        </w:rPr>
+      </w:r>
+    </w:p>
+    <w:p>
+      <w:pPr>
+        <w:widowControl w:val="1"/>
+        <w:spacing w:after="160" w:lineRule="auto"/>
+        <w:rPr/>
+      </w:pPr>
+      <w:r>
+        <w:rPr>
+          <w:rtl w:val="0"/>
+        </w:rPr>
+      </w:r>
+    </w:p>
+    <w:p>
+      <w:pPr>
+        <w:widowControl w:val="1"/>
+        <w:spacing w:after="160" w:lineRule="auto"/>
+        <w:rPr/>
+      </w:pPr>
+      <w:r>
+        <w:rPr>
+          <w:rtl w:val="0"/>
+        </w:rPr>
+      </w:r>
+    </w:p>
+    <w:p>
+      <w:pPr>
+        <w:widowControl w:val="1"/>
+        <w:spacing w:after="160" w:lineRule="auto"/>
+        <w:rPr/>
+      </w:pPr>
+      <w:r>
+        <w:rPr>
+          <w:rtl w:val="0"/>
+        </w:rPr>
       </w:r>
     </w:p>
     <w:p>
@@ -12276,18 +12396,8 @@
         <w:rPr>
           <w:rtl w:val="0"/>
         </w:rPr>
-        <w:t xml:space="preserve">Los mockups prototipos del sistema tanto para la versión web como para la movíl se encuentran ubicados en la carpeta: </w:t>
-      </w:r>
-      <w:hyperlink r:id="rId9">
-        <w:r>
-          <w:rPr>
-            <w:color w:val="1155cc"/>
-            <w:u w:val="single"/>
-            <w:rtl w:val="0"/>
-          </w:rPr>
-          <w:t xml:space="preserve">Mockups</w:t>
-        </w:r>
-      </w:hyperlink>
+        <w:t xml:space="preserve">Los mockups prototipos del sistema tanto para la versión web como para la movíl se encuentran ubicados en la carpeta: Mockups</w:t>
+      </w:r>
       <w:r>
         <w:rPr>
           <w:rtl w:val="0"/>
@@ -16283,18 +16393,8 @@
         <w:rPr>
           <w:rtl w:val="0"/>
         </w:rPr>
-        <w:t xml:space="preserve">El diagrama lo podrás encontrar en el siguiente archivo de la carpeta “Control”: </w:t>
-      </w:r>
-      <w:hyperlink r:id="rId10">
-        <w:r>
-          <w:rPr>
-            <w:color w:val="1155cc"/>
-            <w:u w:val="single"/>
-            <w:rtl w:val="0"/>
-          </w:rPr>
-          <w:t xml:space="preserve">Diagrama de casos de uso</w:t>
-        </w:r>
-      </w:hyperlink>
+        <w:t xml:space="preserve">El diagrama general al igual que los individuales por caso  de uso lo podrás encontrar en la carpeta “Diagramas de casos de uso” </w:t>
+      </w:r>
       <w:r>
         <w:rPr>
           <w:rtl w:val="0"/>

</xml_diff>